<commit_message>
Remove Travelyt intake route and add launch policies
</commit_message>
<xml_diff>
--- a/docs/Travelyt/17-Driver-Admin-Workflow-Policy.docx
+++ b/docs/Travelyt/17-Driver-Admin-Workflow-Policy.docx
@@ -34,7 +34,7 @@
           <w:color w:val="5A6370"/>
           <w:sz w:val="26"/>
         </w:rPr>
-        <w:t>Launch SOP for access codes, admin control, QR intake, custody proof, and live workflow testing</w:t>
+        <w:t>Launch SOP for access codes, admin control, booking state, custody proof, and live workflow testing</w:t>
       </w:r>
     </w:p>
     <w:tbl>
@@ -166,7 +166,7 @@
                 <w:color w:val="0B2545"/>
                 <w:sz w:val="19"/>
               </w:rPr>
-              <w:t>Travelyt admin portal, driver portal, QR intake, booking queue, and custody workflows</w:t>
+              <w:t>Travelyt admin portal, driver portal, booking queue, and custody workflows</w:t>
             </w:r>
           </w:p>
         </w:tc>
@@ -533,7 +533,7 @@
           <w:color w:val="0B2545"/>
           <w:sz w:val="21"/>
         </w:rPr>
-        <w:t>The booking moves through the correct states instead of skipping from intake to completion.</w:t>
+        <w:t>The booking moves through the correct states instead of skipping from request to completion.</w:t>
       </w:r>
     </w:p>
     <w:p>
@@ -899,7 +899,7 @@
                 <w:color w:val="0B2545"/>
                 <w:sz w:val="18"/>
               </w:rPr>
-              <w:t>Customer / QR submitter</w:t>
+              <w:t>Customer / requester</w:t>
             </w:r>
           </w:p>
         </w:tc>
@@ -919,7 +919,7 @@
                 <w:color w:val="0B2545"/>
                 <w:sz w:val="18"/>
               </w:rPr>
-              <w:t>Submit sender, receiver, trip, bag, and contact details.</w:t>
+              <w:t>Submit trip, bag, contact, pickup, and delivery details.</w:t>
             </w:r>
           </w:p>
         </w:tc>
@@ -1242,7 +1242,7 @@
         <w:pStyle w:val="Heading1"/>
       </w:pPr>
       <w:r>
-        <w:t>6. Booking And QR Intake Policy</w:t>
+        <w:t>6. Booking Request Policy</w:t>
       </w:r>
     </w:p>
     <w:p>
@@ -1255,7 +1255,7 @@
           <w:color w:val="0B2545"/>
           <w:sz w:val="22"/>
         </w:rPr>
-        <w:t>Travelyt now supports a QR-style intake path for sender and receiver information. The intended use is simple: customer scans the QR code, fills out sender/receiver/trip/bag details, and the submission appears in the admin queue as a pending booking. Staff can copy the structured notes for manual processing.</w:t>
+        <w:t>Travelyt booking requests should start as controlled requests, not operational commitments. A customer quote or booking form can collect trip, bag, contact, pickup, delivery, and handling details, but admin still has to confirm service feasibility, payment status, driver assignment, and custody readiness before bags move.</w:t>
       </w:r>
     </w:p>
     <w:p>
@@ -1268,7 +1268,7 @@
           <w:color w:val="0B2545"/>
           <w:sz w:val="22"/>
         </w:rPr>
-        <w:t>QR intake policy:</w:t>
+        <w:t>Booking request policy:</w:t>
       </w:r>
     </w:p>
     <w:p>
@@ -1283,7 +1283,7 @@
           <w:color w:val="0B2545"/>
           <w:sz w:val="21"/>
         </w:rPr>
-        <w:t>QR intake creates pending bookings only. It must not create paid, assigned, accepted, or completed jobs.</w:t>
+        <w:t>Public booking creation creates pending bookings only. It must not create paid, assigned, accepted, or completed jobs.</w:t>
       </w:r>
     </w:p>
     <w:p>
@@ -1298,7 +1298,7 @@
           <w:color w:val="0B2545"/>
           <w:sz w:val="21"/>
         </w:rPr>
-        <w:t>Sender/receiver details should be preserved in notes until a dedicated database model exists.</w:t>
+        <w:t>Customer-provided trip, bag, and contact details should be preserved until admin confirms the route.</w:t>
       </w:r>
     </w:p>
     <w:p>
@@ -1328,22 +1328,7 @@
           <w:color w:val="0B2545"/>
           <w:sz w:val="21"/>
         </w:rPr>
-        <w:t>If Mo sends a paper/template version, update the QR form fields to match the exact required fields before using it broadly.</w:t>
-      </w:r>
-    </w:p>
-    <w:p>
-      <w:pPr>
-        <w:pStyle w:val="ListBullet"/>
-        <w:spacing w:before="0" w:after="80" w:line="300" w:lineRule="auto"/>
-        <w:ind w:left="540" w:hanging="271"/>
-      </w:pPr>
-      <w:r>
-        <w:rPr>
-          <w:rFonts w:ascii="Calibri" w:hAnsi="Calibri"/>
-          <w:color w:val="0B2545"/>
-          <w:sz w:val="21"/>
-        </w:rPr>
-        <w:t>Future DHL/airline integration is separate. The launch version is a clean intake and copy/paste workflow.</w:t>
+        <w:t>Future DHL, carrier, or airline integration is separate from the Travelyt launch booking request flow.</w:t>
       </w:r>
     </w:p>
     <w:p>
@@ -1483,7 +1468,7 @@
                 <w:color w:val="0B2545"/>
                 <w:sz w:val="18"/>
               </w:rPr>
-              <w:t>Intake</w:t>
+              <w:t>Request</w:t>
             </w:r>
           </w:p>
         </w:tc>
@@ -1503,7 +1488,7 @@
                 <w:color w:val="0B2545"/>
                 <w:sz w:val="18"/>
               </w:rPr>
-              <w:t>Customer or staff creates booking through quote flow or QR intake.</w:t>
+              <w:t>Customer or staff creates booking through quote flow, support, or admin.</w:t>
             </w:r>
           </w:p>
         </w:tc>
@@ -3734,7 +3719,7 @@
           <w:color w:val="0B2545"/>
           <w:sz w:val="21"/>
         </w:rPr>
-        <w:t>QR intake is a launch helper that creates a pending admin-queue record. It is not a DHL or airline label integration yet.</w:t>
+        <w:t>Public booking creation has been hardened so customer submissions start as pending and cannot set driver assignment or paid state.</w:t>
       </w:r>
     </w:p>
     <w:p>
@@ -3749,22 +3734,7 @@
           <w:color w:val="0B2545"/>
           <w:sz w:val="21"/>
         </w:rPr>
-        <w:t>Public booking creation has been hardened so customer/QR submissions start as pending and cannot set driver assignment or paid state.</w:t>
-      </w:r>
-    </w:p>
-    <w:p>
-      <w:pPr>
-        <w:pStyle w:val="ListBullet"/>
-        <w:spacing w:before="0" w:after="80" w:line="300" w:lineRule="auto"/>
-        <w:ind w:left="540" w:hanging="271"/>
-      </w:pPr>
-      <w:r>
-        <w:rPr>
-          <w:rFonts w:ascii="Calibri" w:hAnsi="Calibri"/>
-          <w:color w:val="0B2545"/>
-          <w:sz w:val="21"/>
-        </w:rPr>
-        <w:t>The policy should be revised after the exact Mo template arrives and again after background-check/MFA/vendor flows are finalized.</w:t>
+        <w:t>The policy should be revised after background-check/MFA/vendor flows are finalized.</w:t>
       </w:r>
     </w:p>
     <w:sectPr>

</xml_diff>